<commit_message>
docs(r6): update source key and quarter table
</commit_message>
<xml_diff>
--- a/docs/r6/data_dictionary/Ontology_V1.2_資料字典暨協作手冊.docx
+++ b/docs/r6/data_dictionary/Ontology_V1.2_資料字典暨協作手冊.docx
@@ -19986,6 +19986,11 @@
       </w:r>
     </w:p>
     <w:p>
+      <w:r>
+        <w:t>2026-06-17 起，10_news_source_whitelist 的來源識別欄位由 source_id 調整為 source_key。</w:t>
+      </w:r>
+    </w:p>
+    <w:p>
       <w:pPr>
         <w:pStyle w:val="21"/>
         <w:rPr>
@@ -20007,42 +20012,134 @@
         </w:rPr>
       </w:pPr>
       <w:r>
-        <w:rPr>
-          <w:lang w:eastAsia="zh-TW"/>
-        </w:rPr>
+        <w:t>欄位名稱：source_key</w:t>
+      </w:r>
+    </w:p>
+    <w:p>
+      <w:pPr>
+        <w:rPr>
+          <w:lang w:eastAsia="zh-TW"/>
+        </w:rPr>
+      </w:pPr>
+      <w:r>
+        <w:rPr>
+          <w:lang w:eastAsia="zh-TW"/>
+        </w:rPr>
+        <w:t>中文名稱：來源代碼</w:t>
+      </w:r>
+    </w:p>
+    <w:p>
+      <w:r>
+        <w:t>英文名稱：source_key</w:t>
+      </w:r>
+    </w:p>
+    <w:p>
+      <w:r>
+        <w:t>資料型態：</w:t>
+      </w:r>
+      <w:r>
+        <w:t>Text</w:t>
+      </w:r>
+    </w:p>
+    <w:p>
+      <w:r>
+        <w:t>範例：</w:t>
+      </w:r>
+      <w:r>
+        <w:t>PRIMARY_MOPS</w:t>
+      </w:r>
+    </w:p>
+    <w:p>
+      <w:r>
+        <w:t>商業意義：來源唯一識別鍵，用於標準化新聞、公司公告、MOPS、公司 IR 等資料來源。此欄位取代原 source_id，以配合 R4 source mapping 與開發架構命名。</w:t>
+      </w:r>
+    </w:p>
+    <w:p>
+      <w:r>
+        <w:t>Agent 使用情境：Retriever 可用 source_key 判斷文件來源，Eval 可檢查回答引用是否來自白名單。</w:t>
+      </w:r>
+    </w:p>
+    <w:p>
+      <w:pPr>
+        <w:rPr>
+          <w:lang w:eastAsia="zh-TW"/>
+        </w:rPr>
+      </w:pPr>
+      <w:r>
+        <w:rPr>
+          <w:lang w:eastAsia="zh-TW"/>
+        </w:rPr>
+        <w:t>資料治理目的：避免只靠來源名稱文字比對，支援來源治理。</w:t>
+      </w:r>
+    </w:p>
+    <w:p>
+      <w:proofErr w:type="spellStart"/>
+      <w:r>
+        <w:t>常見誤用：用</w:t>
+      </w:r>
+      <w:proofErr w:type="spellEnd"/>
+      <w:r>
+        <w:t xml:space="preserve"> </w:t>
+      </w:r>
+      <w:proofErr w:type="spellStart"/>
+      <w:r>
+        <w:t>source_name</w:t>
+      </w:r>
+      <w:proofErr w:type="spellEnd"/>
+      <w:r>
+        <w:t xml:space="preserve"> </w:t>
+      </w:r>
+      <w:proofErr w:type="spellStart"/>
+      <w:r>
+        <w:t>當程式判斷欄位</w:t>
+      </w:r>
+      <w:proofErr w:type="spellEnd"/>
+      <w:r>
+        <w:t>。</w:t>
+      </w:r>
+    </w:p>
+    <w:p>
+      <w:r>
+        <w:t>Co-work 注意事項：新增來源需先定義 source_key 與治理規則。2026-06-17 起，10_news_source_whitelist 的來源識別欄位由 source_id 調整為 source_key。</w:t>
+      </w:r>
+    </w:p>
+    <w:p>
+      <w:r>
+        <w:t>Future Extension</w:t>
+      </w:r>
+      <w:r>
+        <w:t>：可對接</w:t>
+      </w:r>
+      <w:r>
+        <w:t xml:space="preserve"> crawler source registry</w:t>
+      </w:r>
+      <w:r>
+        <w:t>。</w:t>
+      </w:r>
+    </w:p>
+    <w:p>
+      <w:pPr>
+        <w:pStyle w:val="31"/>
+      </w:pPr>
+      <w:r>
         <w:t>欄位名稱：</w:t>
       </w:r>
-      <w:proofErr w:type="spellStart"/>
-      <w:r>
-        <w:rPr>
-          <w:lang w:eastAsia="zh-TW"/>
-        </w:rPr>
-        <w:t>source_id</w:t>
-      </w:r>
-      <w:proofErr w:type="spellEnd"/>
-    </w:p>
-    <w:p>
-      <w:pPr>
-        <w:rPr>
-          <w:lang w:eastAsia="zh-TW"/>
-        </w:rPr>
-      </w:pPr>
-      <w:r>
-        <w:rPr>
-          <w:lang w:eastAsia="zh-TW"/>
-        </w:rPr>
-        <w:t>中文名稱：來源代碼</w:t>
-      </w:r>
-    </w:p>
-    <w:p>
-      <w:proofErr w:type="spellStart"/>
+      <w:r>
+        <w:t>source_name</w:t>
+      </w:r>
+    </w:p>
+    <w:p>
+      <w:r>
+        <w:t>中文名稱：來源名稱</w:t>
+      </w:r>
+    </w:p>
+    <w:p>
       <w:r>
         <w:t>英文名稱：</w:t>
       </w:r>
       <w:r>
-        <w:t>source_id</w:t>
-      </w:r>
-      <w:proofErr w:type="spellEnd"/>
+        <w:t>source_name</w:t>
+      </w:r>
     </w:p>
     <w:p>
       <w:r>
@@ -20054,22 +20151,24 @@
     </w:p>
     <w:p>
       <w:r>
-        <w:t>範例：</w:t>
-      </w:r>
-      <w:r>
-        <w:t>PRIMARY_MOPS</w:t>
-      </w:r>
-    </w:p>
-    <w:p>
-      <w:r>
-        <w:lastRenderedPageBreak/>
-        <w:t>商業意義：新聞或官方資料來源的穩定</w:t>
-      </w:r>
-      <w:r>
-        <w:t xml:space="preserve"> ID</w:t>
-      </w:r>
-      <w:r>
-        <w:t>，讓系統可以管理來源規則。</w:t>
+        <w:t>範例：公開資訊觀測站</w:t>
+      </w:r>
+    </w:p>
+    <w:p>
+      <w:r>
+        <w:t>商業意義：人可讀的來源名稱，例如</w:t>
+      </w:r>
+      <w:r>
+        <w:t xml:space="preserve"> TWSE Announcement</w:t>
+      </w:r>
+      <w:r>
+        <w:t>、</w:t>
+      </w:r>
+      <w:r>
+        <w:t>Company IR Website</w:t>
+      </w:r>
+      <w:r>
+        <w:t>。</w:t>
       </w:r>
     </w:p>
     <w:p>
@@ -20080,193 +20179,37 @@
         <w:t>使用情境：</w:t>
       </w:r>
       <w:r>
-        <w:t xml:space="preserve">Retriever </w:t>
-      </w:r>
-      <w:r>
-        <w:t>可用</w:t>
-      </w:r>
-      <w:r>
-        <w:t xml:space="preserve"> source_id </w:t>
-      </w:r>
-      <w:r>
-        <w:t>判斷文件來源，</w:t>
-      </w:r>
-      <w:r>
-        <w:t xml:space="preserve">Eval </w:t>
-      </w:r>
-      <w:r>
-        <w:t>可檢查回答引用是否來自白名單。</w:t>
-      </w:r>
-    </w:p>
-    <w:p>
-      <w:pPr>
-        <w:rPr>
-          <w:lang w:eastAsia="zh-TW"/>
-        </w:rPr>
-      </w:pPr>
-      <w:r>
-        <w:rPr>
-          <w:lang w:eastAsia="zh-TW"/>
-        </w:rPr>
-        <w:t>資料治理目的：避免只靠來源名稱文字比對，支援來源治理。</w:t>
-      </w:r>
-    </w:p>
-    <w:p>
-      <w:proofErr w:type="spellStart"/>
-      <w:r>
-        <w:t>常見誤用：用</w:t>
-      </w:r>
-      <w:proofErr w:type="spellEnd"/>
-      <w:r>
-        <w:t xml:space="preserve"> </w:t>
-      </w:r>
-      <w:proofErr w:type="spellStart"/>
-      <w:r>
-        <w:t>source_name</w:t>
-      </w:r>
-      <w:proofErr w:type="spellEnd"/>
-      <w:r>
-        <w:t xml:space="preserve"> </w:t>
-      </w:r>
-      <w:proofErr w:type="spellStart"/>
-      <w:r>
-        <w:t>當程式判斷欄位</w:t>
-      </w:r>
-      <w:proofErr w:type="spellEnd"/>
+        <w:t xml:space="preserve">Agent </w:t>
+      </w:r>
+      <w:r>
+        <w:t>在引用時可顯示</w:t>
+      </w:r>
+      <w:r>
+        <w:t xml:space="preserve"> source_name </w:t>
+      </w:r>
+      <w:r>
+        <w:t>讓使用者知道資料來自哪裡。</w:t>
+      </w:r>
+    </w:p>
+    <w:p>
+      <w:r>
+        <w:t>資料治理目的：提高來源透明度。</w:t>
+      </w:r>
+    </w:p>
+    <w:p>
+      <w:r>
+        <w:t>常見誤用：名稱看起來官方就直接當事實，不檢查</w:t>
+      </w:r>
+      <w:r>
+        <w:t xml:space="preserve"> allowed_for_fact</w:t>
+      </w:r>
       <w:r>
         <w:t>。</w:t>
       </w:r>
     </w:p>
     <w:p>
       <w:r>
-        <w:t xml:space="preserve">Co-work </w:t>
-      </w:r>
-      <w:r>
-        <w:t>注意事項：新增來源需先定義</w:t>
-      </w:r>
-      <w:r>
-        <w:t xml:space="preserve"> source_id </w:t>
-      </w:r>
-      <w:r>
-        <w:t>與治理規則。</w:t>
-      </w:r>
-    </w:p>
-    <w:p>
-      <w:r>
-        <w:t>Future Extension</w:t>
-      </w:r>
-      <w:r>
-        <w:t>：可對接</w:t>
-      </w:r>
-      <w:r>
-        <w:t xml:space="preserve"> crawler source registry</w:t>
-      </w:r>
-      <w:r>
-        <w:t>。</w:t>
-      </w:r>
-    </w:p>
-    <w:p>
-      <w:pPr>
-        <w:pStyle w:val="31"/>
-      </w:pPr>
-      <w:r>
-        <w:t>欄位名稱：</w:t>
-      </w:r>
-      <w:r>
-        <w:t>source_name</w:t>
-      </w:r>
-    </w:p>
-    <w:p>
-      <w:r>
-        <w:t>中文名稱：來源名稱</w:t>
-      </w:r>
-    </w:p>
-    <w:p>
-      <w:r>
-        <w:t>英文名稱：</w:t>
-      </w:r>
-      <w:r>
-        <w:t>source_name</w:t>
-      </w:r>
-    </w:p>
-    <w:p>
-      <w:r>
-        <w:t>資料型態：</w:t>
-      </w:r>
-      <w:r>
-        <w:t>Text</w:t>
-      </w:r>
-    </w:p>
-    <w:p>
-      <w:r>
-        <w:t>範例：公開資訊觀測站</w:t>
-      </w:r>
-    </w:p>
-    <w:p>
-      <w:r>
-        <w:t>商業意義：人可讀的來源名稱，例如</w:t>
-      </w:r>
-      <w:r>
-        <w:t xml:space="preserve"> TWSE Announcement</w:t>
-      </w:r>
-      <w:r>
-        <w:t>、</w:t>
-      </w:r>
-      <w:r>
-        <w:t>Company IR Website</w:t>
-      </w:r>
-      <w:r>
-        <w:t>。</w:t>
-      </w:r>
-    </w:p>
-    <w:p>
-      <w:r>
-        <w:t xml:space="preserve">Agent </w:t>
-      </w:r>
-      <w:r>
-        <w:t>使用情境：</w:t>
-      </w:r>
-      <w:r>
-        <w:t xml:space="preserve">Agent </w:t>
-      </w:r>
-      <w:r>
-        <w:t>在引用時可顯示</w:t>
-      </w:r>
-      <w:r>
-        <w:t xml:space="preserve"> source_name </w:t>
-      </w:r>
-      <w:r>
-        <w:t>讓使用者知道資料來自哪裡。</w:t>
-      </w:r>
-    </w:p>
-    <w:p>
-      <w:r>
-        <w:t>資料治理目的：提高來源透明度。</w:t>
-      </w:r>
-    </w:p>
-    <w:p>
-      <w:r>
-        <w:t>常見誤用：名稱看起來官方就直接當事實，不檢查</w:t>
-      </w:r>
-      <w:r>
-        <w:t xml:space="preserve"> allowed_for_fact</w:t>
-      </w:r>
-      <w:r>
-        <w:t>。</w:t>
-      </w:r>
-    </w:p>
-    <w:p>
-      <w:r>
-        <w:t xml:space="preserve">Co-work </w:t>
-      </w:r>
-      <w:r>
-        <w:t>注意事項：來源名稱變更時，</w:t>
-      </w:r>
-      <w:r>
-        <w:t xml:space="preserve">source_id </w:t>
-      </w:r>
-      <w:r>
-        <w:t>應保持穩定。</w:t>
+        <w:t>Co-work 注意事項：來源名稱變更時，source_key 應保持穩定。</w:t>
       </w:r>
     </w:p>
     <w:p>
@@ -22502,6 +22445,141 @@
       </w:r>
       <w:r>
         <w:t>。</w:t>
+      </w:r>
+    </w:p>
+    <w:p>
+      <w:r>
+        <w:t xml:space="preserve">16_quarter_table｜季度對照表</w:t>
+      </w:r>
+    </w:p>
+    <w:p>
+      <w:r>
+        <w:t xml:space="preserve">Sheet Business Meaning</w:t>
+      </w:r>
+    </w:p>
+    <w:p>
+      <w:r>
+        <w:t xml:space="preserve">16_quarter_table 用於建立 fiscal_period、year、quarter、yyyyqq、季度起訖日期與 month_keys 的標準對照關係，協助法說會、月營收與財務資料進行期間對齊。</w:t>
+      </w:r>
+    </w:p>
+    <w:p>
+      <w:r>
+        <w:t xml:space="preserve">Agent / RAG / Eval 使用方式</w:t>
+      </w:r>
+    </w:p>
+    <w:p>
+      <w:r>
+        <w:t xml:space="preserve">Retriever、Eval 與資料工程可使用此表將 2025Q1 等 fiscal_period 對齊 year、quarter、yyyyqq、start_date、end_date 與月份代碼，降低季度與月份代碼混用風險。</w:t>
+      </w:r>
+    </w:p>
+    <w:p>
+      <w:r>
+        <w:t xml:space="preserve">欄位逐欄說明</w:t>
+      </w:r>
+    </w:p>
+    <w:p>
+      <w:r>
+        <w:t xml:space="preserve">欄位名稱：fiscal_period</w:t>
+      </w:r>
+    </w:p>
+    <w:p>
+      <w:r>
+        <w:t xml:space="preserve">說明：季度期間，格式為 YYYYQn，例如 2025Q1。</w:t>
+      </w:r>
+    </w:p>
+    <w:p>
+      <w:r>
+        <w:t xml:space="preserve">欄位名稱：year</w:t>
+      </w:r>
+    </w:p>
+    <w:p>
+      <w:r>
+        <w:t xml:space="preserve">說明：西元年。</w:t>
+      </w:r>
+    </w:p>
+    <w:p>
+      <w:r>
+        <w:t xml:space="preserve">欄位名稱：quarter</w:t>
+      </w:r>
+    </w:p>
+    <w:p>
+      <w:r>
+        <w:t xml:space="preserve">說明：季度，1～4。</w:t>
+      </w:r>
+    </w:p>
+    <w:p>
+      <w:r>
+        <w:t xml:space="preserve">欄位名稱：yyyyqq</w:t>
+      </w:r>
+    </w:p>
+    <w:p>
+      <w:r>
+        <w:t xml:space="preserve">說明：季度代碼，格式為 YYYYQQ，例如 202501 代表 2025 年第 1 季。</w:t>
+      </w:r>
+    </w:p>
+    <w:p>
+      <w:r>
+        <w:t xml:space="preserve">欄位名稱：quarter_start_month</w:t>
+      </w:r>
+    </w:p>
+    <w:p>
+      <w:r>
+        <w:t xml:space="preserve">說明：該季度起始月份。</w:t>
+      </w:r>
+    </w:p>
+    <w:p>
+      <w:r>
+        <w:t xml:space="preserve">欄位名稱：quarter_end_month</w:t>
+      </w:r>
+    </w:p>
+    <w:p>
+      <w:r>
+        <w:t xml:space="preserve">說明：該季度結束月份。</w:t>
+      </w:r>
+    </w:p>
+    <w:p>
+      <w:r>
+        <w:t xml:space="preserve">欄位名稱：start_date</w:t>
+      </w:r>
+    </w:p>
+    <w:p>
+      <w:r>
+        <w:t xml:space="preserve">說明：該季度起始日期，ISO date 格式。</w:t>
+      </w:r>
+    </w:p>
+    <w:p>
+      <w:r>
+        <w:t xml:space="preserve">欄位名稱：end_date</w:t>
+      </w:r>
+    </w:p>
+    <w:p>
+      <w:r>
+        <w:t xml:space="preserve">說明：該季度結束日期，ISO date 格式。</w:t>
+      </w:r>
+    </w:p>
+    <w:p>
+      <w:r>
+        <w:t xml:space="preserve">欄位名稱：month_keys</w:t>
+      </w:r>
+    </w:p>
+    <w:p>
+      <w:r>
+        <w:t xml:space="preserve">說明：該季度包含的月份代碼，逗號分隔，例如 202501,202502,202503。</w:t>
+      </w:r>
+    </w:p>
+    <w:p>
+      <w:r>
+        <w:t xml:space="preserve">欄位名稱：r6_notes</w:t>
+      </w:r>
+    </w:p>
+    <w:p>
+      <w:r>
+        <w:t xml:space="preserve">說明：R6 補充說明。</w:t>
+      </w:r>
+    </w:p>
+    <w:p>
+      <w:r>
+        <w:t xml:space="preserve">重要注意：yyyyqq 為季度代碼，不等同於 revenue_yyyymm 或月份代碼。若需進行月營收比較，仍需搭配後續 financial_metrics metadata 設計。</w:t>
       </w:r>
     </w:p>
     <w:p>
@@ -27421,6 +27499,38 @@
                 <w:sz w:val="17"/>
               </w:rPr>
               <w:t>Standardized source taxonomy governance around source_id, source_type, allowed_for_fact, and citation_required; downstream source labels must map to governed source fields.</w:t>
+            </w:r>
+          </w:p>
+        </w:tc>
+      </w:tr>
+      <w:tr>
+        <w:tc>
+          <w:tcPr>
+            <w:tcW w:type="dxa" w:w="3312"/>
+          </w:tcPr>
+          <w:p>
+            <w:r>
+              <w:t>2026-06-17</w:t>
+            </w:r>
+          </w:p>
+        </w:tc>
+        <w:tc>
+          <w:tcPr>
+            <w:tcW w:type="dxa" w:w="3312"/>
+          </w:tcPr>
+          <w:p>
+            <w:r>
+              <w:t>SOURCE_KEY_AND_QUARTER_TABLE</w:t>
+            </w:r>
+          </w:p>
+        </w:tc>
+        <w:tc>
+          <w:tcPr>
+            <w:tcW w:type="dxa" w:w="3312"/>
+          </w:tcPr>
+          <w:p>
+            <w:r>
+              <w:t>Renamed 10_news_source_whitelist.source_id to source_key for schema alignment with R4 source mapping. Added 16_quarter_table covering 2024Q1 through 2026Q4 with fiscal_period, year, quarter, yyyyqq, start_date, end_date, and month_keys mapping for quarter/month alignment.</w:t>
             </w:r>
           </w:p>
         </w:tc>
@@ -30143,6 +30253,38 @@
       </w:r>
       <w:r>
         <w:t>2026-06-09｜V1_2_REVENUE_METRICS_EXTENSION｜Added revenue cumulative metrics and revenue delta metrics. Standardized revenue storage unit: currency=TWD; unit=TWD_thousand.</w:t>
+      </w:r>
+    </w:p>
+    <w:p/>
+    <w:p/>
+    <w:p/>
+    <w:p/>
+    <w:p/>
+    <w:p/>
+    <w:p/>
+    <w:p/>
+    <w:p/>
+    <w:p/>
+    <w:p/>
+    <w:p/>
+    <w:p/>
+    <w:p/>
+    <w:p/>
+    <w:p/>
+    <w:p/>
+    <w:p/>
+    <w:p/>
+    <w:p/>
+    <w:p/>
+    <w:p/>
+    <w:p/>
+    <w:p/>
+    <w:p/>
+    <w:p/>
+    <w:p/>
+    <w:p>
+      <w:r>
+        <w:t>Change Log：2026-06-17｜SOURCE_KEY_AND_QUARTER_TABLE｜Renamed 10_news_source_whitelist.source_id to source_key; added 16_quarter_table covering 2024Q1 through 2026Q4 for fiscal_period, yyyyqq, start_date, end_date, and month_keys alignment.</w:t>
       </w:r>
     </w:p>
     <w:sectPr>

</xml_diff>

<commit_message>
docs(r6): update disclosure events and news sources
</commit_message>
<xml_diff>
--- a/docs/r6/data_dictionary/Ontology_V1.2_資料字典暨協作手冊.docx
+++ b/docs/r6/data_dictionary/Ontology_V1.2_資料字典暨協作手冊.docx
@@ -16533,7 +16533,7 @@
         <w:t>商業意義：若風險明確來自公開事件，填</w:t>
       </w:r>
       <w:r>
-        <w:t xml:space="preserve"> 04_disclosure_events.event_id</w:t>
+        <w:t xml:space="preserve"> 04_disclosure_events.event_key</w:t>
       </w:r>
       <w:r>
         <w:t>。</w:t>
@@ -30285,6 +30285,1003 @@
     <w:p>
       <w:r>
         <w:t>Change Log：2026-06-17｜SOURCE_KEY_AND_QUARTER_TABLE｜Renamed 10_news_source_whitelist.source_id to source_key; added 16_quarter_table covering 2024Q1 through 2026Q4 for fiscal_period, yyyyqq, start_date, end_date, and month_keys alignment.</w:t>
+      </w:r>
+    </w:p>
+    <w:p>
+      <w:pPr>
+        <w:pStyle w:val="1"/>
+      </w:pPr>
+      <w:r>
+        <w:t>2026-06-18 R6 Ontology Update：Disclosure Events and News Sources</w:t>
+      </w:r>
+    </w:p>
+    <w:p>
+      <w:pPr>
+        <w:pStyle w:val="21"/>
+      </w:pPr>
+      <w:r>
+        <w:t>04_disclosure_events primary key 與分層</w:t>
+      </w:r>
+    </w:p>
+    <w:p>
+      <w:pPr>
+        <w:pStyle w:val="a0"/>
+      </w:pPr>
+      <w:r>
+        <w:t>04_disclosure_events 的 Primary Key 為 event_key。</w:t>
+      </w:r>
+    </w:p>
+    <w:p>
+      <w:pPr>
+        <w:pStyle w:val="a0"/>
+      </w:pPr>
+      <w:r>
+        <w:t>event_key：事件唯一識別鍵，用於區分不同事件類型與子分類，例如 earnings_call、monthly_revenue、major_news.share_buyback。</w:t>
+      </w:r>
+    </w:p>
+    <w:p>
+      <w:pPr>
+        <w:pStyle w:val="a0"/>
+      </w:pPr>
+      <w:r>
+        <w:t>event_type：第一層事件分類，例如 earnings_call、major_news、news、monthly_revenue。</w:t>
+      </w:r>
+    </w:p>
+    <w:p>
+      <w:pPr>
+        <w:pStyle w:val="a0"/>
+      </w:pPr>
+      <w:r>
+        <w:t>event_subtype：第二層事件分類，主要用於 major_news 底下的子分類，例如 capital_increase、capital_reduction、share_buyback、merger、asset_disposal、new_factory、others。</w:t>
+      </w:r>
+    </w:p>
+    <w:p>
+      <w:pPr>
+        <w:pStyle w:val="a0"/>
+      </w:pPr>
+      <w:r>
+        <w:t>event_type 不作為 primary key，原因是 major_news 底下會有多個子分類，若以 event_type 作為 primary key 會造成分類衝突。</w:t>
+      </w:r>
+    </w:p>
+    <w:p>
+      <w:pPr>
+        <w:pStyle w:val="a0"/>
+      </w:pPr>
+      <w:r>
+        <w:t>major_news.others 用於暫時無法細分的重大訊息，後續可依測試結果再拆分 subtype。</w:t>
+      </w:r>
+    </w:p>
+    <w:p>
+      <w:pPr>
+        <w:pStyle w:val="a0"/>
+      </w:pPr>
+      <w:r>
+        <w:t>此調整用於支援 R4 chunks metadata tagging、semantic layer filtering 與 R6 citation QA，降低法說會、新聞、月營收、重大訊息彼此混用的情況。</w:t>
+      </w:r>
+    </w:p>
+    <w:tbl>
+      <w:tblPr>
+        <w:tblStyle w:val="aff2"/>
+        <w:tblW w:type="auto" w:w="0"/>
+        <w:tblLook w:firstColumn="1" w:firstRow="1" w:lastColumn="0" w:lastRow="0" w:noHBand="0" w:noVBand="1" w:val="04A0"/>
+      </w:tblPr>
+      <w:tblGrid>
+        <w:gridCol w:w="1987"/>
+        <w:gridCol w:w="1987"/>
+        <w:gridCol w:w="1987"/>
+        <w:gridCol w:w="1987"/>
+        <w:gridCol w:w="1987"/>
+      </w:tblGrid>
+      <w:tr>
+        <w:tc>
+          <w:tcPr>
+            <w:tcW w:type="dxa" w:w="1987"/>
+          </w:tcPr>
+          <w:p>
+            <w:r>
+              <w:t>event_key</w:t>
+            </w:r>
+          </w:p>
+        </w:tc>
+        <w:tc>
+          <w:tcPr>
+            <w:tcW w:type="dxa" w:w="1987"/>
+          </w:tcPr>
+          <w:p>
+            <w:r>
+              <w:t>event_type</w:t>
+            </w:r>
+          </w:p>
+        </w:tc>
+        <w:tc>
+          <w:tcPr>
+            <w:tcW w:type="dxa" w:w="1987"/>
+          </w:tcPr>
+          <w:p>
+            <w:r>
+              <w:t>event_subtype</w:t>
+            </w:r>
+          </w:p>
+        </w:tc>
+        <w:tc>
+          <w:tcPr>
+            <w:tcW w:type="dxa" w:w="1987"/>
+          </w:tcPr>
+          <w:p>
+            <w:r>
+              <w:t>event_type_name</w:t>
+            </w:r>
+          </w:p>
+        </w:tc>
+        <w:tc>
+          <w:tcPr>
+            <w:tcW w:type="dxa" w:w="1987"/>
+          </w:tcPr>
+          <w:p>
+            <w:r>
+              <w:t>event_subtype_name</w:t>
+            </w:r>
+          </w:p>
+        </w:tc>
+      </w:tr>
+      <w:tr>
+        <w:tc>
+          <w:tcPr>
+            <w:tcW w:type="dxa" w:w="1987"/>
+          </w:tcPr>
+          <w:p>
+            <w:r>
+              <w:t>earnings_call</w:t>
+            </w:r>
+          </w:p>
+        </w:tc>
+        <w:tc>
+          <w:tcPr>
+            <w:tcW w:type="dxa" w:w="1987"/>
+          </w:tcPr>
+          <w:p>
+            <w:r>
+              <w:t>earnings_call</w:t>
+            </w:r>
+          </w:p>
+        </w:tc>
+        <w:tc>
+          <w:tcPr>
+            <w:tcW w:type="dxa" w:w="1987"/>
+          </w:tcPr>
+          <w:p>
+            <w:r/>
+          </w:p>
+        </w:tc>
+        <w:tc>
+          <w:tcPr>
+            <w:tcW w:type="dxa" w:w="1987"/>
+          </w:tcPr>
+          <w:p>
+            <w:r>
+              <w:t>法說會</w:t>
+            </w:r>
+          </w:p>
+        </w:tc>
+        <w:tc>
+          <w:tcPr>
+            <w:tcW w:type="dxa" w:w="1987"/>
+          </w:tcPr>
+          <w:p>
+            <w:r/>
+          </w:p>
+        </w:tc>
+      </w:tr>
+      <w:tr>
+        <w:tc>
+          <w:tcPr>
+            <w:tcW w:type="dxa" w:w="1987"/>
+          </w:tcPr>
+          <w:p>
+            <w:r>
+              <w:t>major_news.capital_increase</w:t>
+            </w:r>
+          </w:p>
+        </w:tc>
+        <w:tc>
+          <w:tcPr>
+            <w:tcW w:type="dxa" w:w="1987"/>
+          </w:tcPr>
+          <w:p>
+            <w:r>
+              <w:t>major_news</w:t>
+            </w:r>
+          </w:p>
+        </w:tc>
+        <w:tc>
+          <w:tcPr>
+            <w:tcW w:type="dxa" w:w="1987"/>
+          </w:tcPr>
+          <w:p>
+            <w:r>
+              <w:t>capital_increase</w:t>
+            </w:r>
+          </w:p>
+        </w:tc>
+        <w:tc>
+          <w:tcPr>
+            <w:tcW w:type="dxa" w:w="1987"/>
+          </w:tcPr>
+          <w:p>
+            <w:r>
+              <w:t>重大訊息</w:t>
+            </w:r>
+          </w:p>
+        </w:tc>
+        <w:tc>
+          <w:tcPr>
+            <w:tcW w:type="dxa" w:w="1987"/>
+          </w:tcPr>
+          <w:p>
+            <w:r>
+              <w:t>增資</w:t>
+            </w:r>
+          </w:p>
+        </w:tc>
+      </w:tr>
+      <w:tr>
+        <w:tc>
+          <w:tcPr>
+            <w:tcW w:type="dxa" w:w="1987"/>
+          </w:tcPr>
+          <w:p>
+            <w:r>
+              <w:t>major_news.capital_reduction</w:t>
+            </w:r>
+          </w:p>
+        </w:tc>
+        <w:tc>
+          <w:tcPr>
+            <w:tcW w:type="dxa" w:w="1987"/>
+          </w:tcPr>
+          <w:p>
+            <w:r>
+              <w:t>major_news</w:t>
+            </w:r>
+          </w:p>
+        </w:tc>
+        <w:tc>
+          <w:tcPr>
+            <w:tcW w:type="dxa" w:w="1987"/>
+          </w:tcPr>
+          <w:p>
+            <w:r>
+              <w:t>capital_reduction</w:t>
+            </w:r>
+          </w:p>
+        </w:tc>
+        <w:tc>
+          <w:tcPr>
+            <w:tcW w:type="dxa" w:w="1987"/>
+          </w:tcPr>
+          <w:p>
+            <w:r>
+              <w:t>重大訊息</w:t>
+            </w:r>
+          </w:p>
+        </w:tc>
+        <w:tc>
+          <w:tcPr>
+            <w:tcW w:type="dxa" w:w="1987"/>
+          </w:tcPr>
+          <w:p>
+            <w:r>
+              <w:t>減資</w:t>
+            </w:r>
+          </w:p>
+        </w:tc>
+      </w:tr>
+      <w:tr>
+        <w:tc>
+          <w:tcPr>
+            <w:tcW w:type="dxa" w:w="1987"/>
+          </w:tcPr>
+          <w:p>
+            <w:r>
+              <w:t>major_news.share_buyback</w:t>
+            </w:r>
+          </w:p>
+        </w:tc>
+        <w:tc>
+          <w:tcPr>
+            <w:tcW w:type="dxa" w:w="1987"/>
+          </w:tcPr>
+          <w:p>
+            <w:r>
+              <w:t>major_news</w:t>
+            </w:r>
+          </w:p>
+        </w:tc>
+        <w:tc>
+          <w:tcPr>
+            <w:tcW w:type="dxa" w:w="1987"/>
+          </w:tcPr>
+          <w:p>
+            <w:r>
+              <w:t>share_buyback</w:t>
+            </w:r>
+          </w:p>
+        </w:tc>
+        <w:tc>
+          <w:tcPr>
+            <w:tcW w:type="dxa" w:w="1987"/>
+          </w:tcPr>
+          <w:p>
+            <w:r>
+              <w:t>重大訊息</w:t>
+            </w:r>
+          </w:p>
+        </w:tc>
+        <w:tc>
+          <w:tcPr>
+            <w:tcW w:type="dxa" w:w="1987"/>
+          </w:tcPr>
+          <w:p>
+            <w:r>
+              <w:t>庫藏股</w:t>
+            </w:r>
+          </w:p>
+        </w:tc>
+      </w:tr>
+      <w:tr>
+        <w:tc>
+          <w:tcPr>
+            <w:tcW w:type="dxa" w:w="1987"/>
+          </w:tcPr>
+          <w:p>
+            <w:r>
+              <w:t>major_news.merger</w:t>
+            </w:r>
+          </w:p>
+        </w:tc>
+        <w:tc>
+          <w:tcPr>
+            <w:tcW w:type="dxa" w:w="1987"/>
+          </w:tcPr>
+          <w:p>
+            <w:r>
+              <w:t>major_news</w:t>
+            </w:r>
+          </w:p>
+        </w:tc>
+        <w:tc>
+          <w:tcPr>
+            <w:tcW w:type="dxa" w:w="1987"/>
+          </w:tcPr>
+          <w:p>
+            <w:r>
+              <w:t>merger</w:t>
+            </w:r>
+          </w:p>
+        </w:tc>
+        <w:tc>
+          <w:tcPr>
+            <w:tcW w:type="dxa" w:w="1987"/>
+          </w:tcPr>
+          <w:p>
+            <w:r>
+              <w:t>重大訊息</w:t>
+            </w:r>
+          </w:p>
+        </w:tc>
+        <w:tc>
+          <w:tcPr>
+            <w:tcW w:type="dxa" w:w="1987"/>
+          </w:tcPr>
+          <w:p>
+            <w:r>
+              <w:t>併購</w:t>
+            </w:r>
+          </w:p>
+        </w:tc>
+      </w:tr>
+      <w:tr>
+        <w:tc>
+          <w:tcPr>
+            <w:tcW w:type="dxa" w:w="1987"/>
+          </w:tcPr>
+          <w:p>
+            <w:r>
+              <w:t>major_news.asset_disposal</w:t>
+            </w:r>
+          </w:p>
+        </w:tc>
+        <w:tc>
+          <w:tcPr>
+            <w:tcW w:type="dxa" w:w="1987"/>
+          </w:tcPr>
+          <w:p>
+            <w:r>
+              <w:t>major_news</w:t>
+            </w:r>
+          </w:p>
+        </w:tc>
+        <w:tc>
+          <w:tcPr>
+            <w:tcW w:type="dxa" w:w="1987"/>
+          </w:tcPr>
+          <w:p>
+            <w:r>
+              <w:t>asset_disposal</w:t>
+            </w:r>
+          </w:p>
+        </w:tc>
+        <w:tc>
+          <w:tcPr>
+            <w:tcW w:type="dxa" w:w="1987"/>
+          </w:tcPr>
+          <w:p>
+            <w:r>
+              <w:t>重大訊息</w:t>
+            </w:r>
+          </w:p>
+        </w:tc>
+        <w:tc>
+          <w:tcPr>
+            <w:tcW w:type="dxa" w:w="1987"/>
+          </w:tcPr>
+          <w:p>
+            <w:r>
+              <w:t>處分長期投資 / 資產</w:t>
+            </w:r>
+          </w:p>
+        </w:tc>
+      </w:tr>
+      <w:tr>
+        <w:tc>
+          <w:tcPr>
+            <w:tcW w:type="dxa" w:w="1987"/>
+          </w:tcPr>
+          <w:p>
+            <w:r>
+              <w:t>major_news.new_factory</w:t>
+            </w:r>
+          </w:p>
+        </w:tc>
+        <w:tc>
+          <w:tcPr>
+            <w:tcW w:type="dxa" w:w="1987"/>
+          </w:tcPr>
+          <w:p>
+            <w:r>
+              <w:t>major_news</w:t>
+            </w:r>
+          </w:p>
+        </w:tc>
+        <w:tc>
+          <w:tcPr>
+            <w:tcW w:type="dxa" w:w="1987"/>
+          </w:tcPr>
+          <w:p>
+            <w:r>
+              <w:t>new_factory</w:t>
+            </w:r>
+          </w:p>
+        </w:tc>
+        <w:tc>
+          <w:tcPr>
+            <w:tcW w:type="dxa" w:w="1987"/>
+          </w:tcPr>
+          <w:p>
+            <w:r>
+              <w:t>重大訊息</w:t>
+            </w:r>
+          </w:p>
+        </w:tc>
+        <w:tc>
+          <w:tcPr>
+            <w:tcW w:type="dxa" w:w="1987"/>
+          </w:tcPr>
+          <w:p>
+            <w:r>
+              <w:t>擴廠</w:t>
+            </w:r>
+          </w:p>
+        </w:tc>
+      </w:tr>
+      <w:tr>
+        <w:tc>
+          <w:tcPr>
+            <w:tcW w:type="dxa" w:w="1987"/>
+          </w:tcPr>
+          <w:p>
+            <w:r>
+              <w:t>major_news.others</w:t>
+            </w:r>
+          </w:p>
+        </w:tc>
+        <w:tc>
+          <w:tcPr>
+            <w:tcW w:type="dxa" w:w="1987"/>
+          </w:tcPr>
+          <w:p>
+            <w:r>
+              <w:t>major_news</w:t>
+            </w:r>
+          </w:p>
+        </w:tc>
+        <w:tc>
+          <w:tcPr>
+            <w:tcW w:type="dxa" w:w="1987"/>
+          </w:tcPr>
+          <w:p>
+            <w:r>
+              <w:t>others</w:t>
+            </w:r>
+          </w:p>
+        </w:tc>
+        <w:tc>
+          <w:tcPr>
+            <w:tcW w:type="dxa" w:w="1987"/>
+          </w:tcPr>
+          <w:p>
+            <w:r>
+              <w:t>重大訊息</w:t>
+            </w:r>
+          </w:p>
+        </w:tc>
+        <w:tc>
+          <w:tcPr>
+            <w:tcW w:type="dxa" w:w="1987"/>
+          </w:tcPr>
+          <w:p>
+            <w:r>
+              <w:t>其他重大訊息</w:t>
+            </w:r>
+          </w:p>
+        </w:tc>
+      </w:tr>
+      <w:tr>
+        <w:tc>
+          <w:tcPr>
+            <w:tcW w:type="dxa" w:w="1987"/>
+          </w:tcPr>
+          <w:p>
+            <w:r>
+              <w:t>news</w:t>
+            </w:r>
+          </w:p>
+        </w:tc>
+        <w:tc>
+          <w:tcPr>
+            <w:tcW w:type="dxa" w:w="1987"/>
+          </w:tcPr>
+          <w:p>
+            <w:r>
+              <w:t>news</w:t>
+            </w:r>
+          </w:p>
+        </w:tc>
+        <w:tc>
+          <w:tcPr>
+            <w:tcW w:type="dxa" w:w="1987"/>
+          </w:tcPr>
+          <w:p>
+            <w:r/>
+          </w:p>
+        </w:tc>
+        <w:tc>
+          <w:tcPr>
+            <w:tcW w:type="dxa" w:w="1987"/>
+          </w:tcPr>
+          <w:p>
+            <w:r>
+              <w:t>新聞</w:t>
+            </w:r>
+          </w:p>
+        </w:tc>
+        <w:tc>
+          <w:tcPr>
+            <w:tcW w:type="dxa" w:w="1987"/>
+          </w:tcPr>
+          <w:p>
+            <w:r/>
+          </w:p>
+        </w:tc>
+      </w:tr>
+      <w:tr>
+        <w:tc>
+          <w:tcPr>
+            <w:tcW w:type="dxa" w:w="1987"/>
+          </w:tcPr>
+          <w:p>
+            <w:r>
+              <w:t>monthly_revenue</w:t>
+            </w:r>
+          </w:p>
+        </w:tc>
+        <w:tc>
+          <w:tcPr>
+            <w:tcW w:type="dxa" w:w="1987"/>
+          </w:tcPr>
+          <w:p>
+            <w:r>
+              <w:t>monthly_revenue</w:t>
+            </w:r>
+          </w:p>
+        </w:tc>
+        <w:tc>
+          <w:tcPr>
+            <w:tcW w:type="dxa" w:w="1987"/>
+          </w:tcPr>
+          <w:p>
+            <w:r/>
+          </w:p>
+        </w:tc>
+        <w:tc>
+          <w:tcPr>
+            <w:tcW w:type="dxa" w:w="1987"/>
+          </w:tcPr>
+          <w:p>
+            <w:r>
+              <w:t>月營收</w:t>
+            </w:r>
+          </w:p>
+        </w:tc>
+        <w:tc>
+          <w:tcPr>
+            <w:tcW w:type="dxa" w:w="1987"/>
+          </w:tcPr>
+          <w:p>
+            <w:r/>
+          </w:p>
+        </w:tc>
+      </w:tr>
+    </w:tbl>
+    <w:p>
+      <w:pPr>
+        <w:pStyle w:val="21"/>
+      </w:pPr>
+      <w:r>
+        <w:t>10_news_source_whitelist source_key 與 Secondary news sources</w:t>
+      </w:r>
+    </w:p>
+    <w:p>
+      <w:pPr>
+        <w:pStyle w:val="a0"/>
+      </w:pPr>
+      <w:r>
+        <w:t>10_news_source_whitelist 使用 source_key 作為來源識別欄位，不使用 source_id 作為新版欄位名稱。</w:t>
+      </w:r>
+    </w:p>
+    <w:p>
+      <w:pPr>
+        <w:pStyle w:val="a0"/>
+      </w:pPr>
+      <w:r>
+        <w:t>SECONDARY_YAHOO：YAHOO財經，Secondary source，source_type 為 News/Data。可作為財經新聞與產業資料線索，但不可替代 MOPS、公司 IR、TWSE、TPEx 等官方來源的財務數字。</w:t>
+      </w:r>
+    </w:p>
+    <w:p>
+      <w:pPr>
+        <w:pStyle w:val="a0"/>
+      </w:pPr>
+      <w:r>
+        <w:t>SECONDARY_NEWS_MEDIA：報章雜誌媒體，Secondary source，source_type 為 News/Data。用於 chunks 無法明確拆出媒體名稱時的統一新聞媒體標籤。可作為財經新聞與產業資料線索，但不可替代 MOPS、公司 IR、TWSE、TPEx 等官方來源的財務數字。</w:t>
+      </w:r>
+    </w:p>
+    <w:tbl>
+      <w:tblPr>
+        <w:tblStyle w:val="aff2"/>
+        <w:tblW w:type="auto" w:w="0"/>
+        <w:tblLook w:firstColumn="1" w:firstRow="1" w:lastColumn="0" w:lastRow="0" w:noHBand="0" w:noVBand="1" w:val="04A0"/>
+      </w:tblPr>
+      <w:tblGrid>
+        <w:gridCol w:w="1242"/>
+        <w:gridCol w:w="1242"/>
+        <w:gridCol w:w="1242"/>
+        <w:gridCol w:w="1242"/>
+        <w:gridCol w:w="1242"/>
+        <w:gridCol w:w="1242"/>
+        <w:gridCol w:w="1242"/>
+        <w:gridCol w:w="1242"/>
+      </w:tblGrid>
+      <w:tr>
+        <w:tc>
+          <w:tcPr>
+            <w:tcW w:type="dxa" w:w="1242"/>
+          </w:tcPr>
+          <w:p>
+            <w:r>
+              <w:t>source_key</w:t>
+            </w:r>
+          </w:p>
+        </w:tc>
+        <w:tc>
+          <w:tcPr>
+            <w:tcW w:type="dxa" w:w="1242"/>
+          </w:tcPr>
+          <w:p>
+            <w:r>
+              <w:t>source_name</w:t>
+            </w:r>
+          </w:p>
+        </w:tc>
+        <w:tc>
+          <w:tcPr>
+            <w:tcW w:type="dxa" w:w="1242"/>
+          </w:tcPr>
+          <w:p>
+            <w:r>
+              <w:t>trust_tier</w:t>
+            </w:r>
+          </w:p>
+        </w:tc>
+        <w:tc>
+          <w:tcPr>
+            <w:tcW w:type="dxa" w:w="1242"/>
+          </w:tcPr>
+          <w:p>
+            <w:r>
+              <w:t>source_type</w:t>
+            </w:r>
+          </w:p>
+        </w:tc>
+        <w:tc>
+          <w:tcPr>
+            <w:tcW w:type="dxa" w:w="1242"/>
+          </w:tcPr>
+          <w:p>
+            <w:r>
+              <w:t>use_case</w:t>
+            </w:r>
+          </w:p>
+        </w:tc>
+        <w:tc>
+          <w:tcPr>
+            <w:tcW w:type="dxa" w:w="1242"/>
+          </w:tcPr>
+          <w:p>
+            <w:r>
+              <w:t>allowed_for_fact</w:t>
+            </w:r>
+          </w:p>
+        </w:tc>
+        <w:tc>
+          <w:tcPr>
+            <w:tcW w:type="dxa" w:w="1242"/>
+          </w:tcPr>
+          <w:p>
+            <w:r>
+              <w:t>r6_note</w:t>
+            </w:r>
+          </w:p>
+        </w:tc>
+        <w:tc>
+          <w:tcPr>
+            <w:tcW w:type="dxa" w:w="1242"/>
+          </w:tcPr>
+          <w:p>
+            <w:r>
+              <w:t>citation_required</w:t>
+            </w:r>
+          </w:p>
+        </w:tc>
+      </w:tr>
+      <w:tr>
+        <w:tc>
+          <w:tcPr>
+            <w:tcW w:type="dxa" w:w="1242"/>
+          </w:tcPr>
+          <w:p>
+            <w:r>
+              <w:t>SECONDARY_YAHOO</w:t>
+            </w:r>
+          </w:p>
+        </w:tc>
+        <w:tc>
+          <w:tcPr>
+            <w:tcW w:type="dxa" w:w="1242"/>
+          </w:tcPr>
+          <w:p>
+            <w:r>
+              <w:t>YAHOO財經</w:t>
+            </w:r>
+          </w:p>
+        </w:tc>
+        <w:tc>
+          <w:tcPr>
+            <w:tcW w:type="dxa" w:w="1242"/>
+          </w:tcPr>
+          <w:p>
+            <w:r>
+              <w:t>Secondary</w:t>
+            </w:r>
+          </w:p>
+        </w:tc>
+        <w:tc>
+          <w:tcPr>
+            <w:tcW w:type="dxa" w:w="1242"/>
+          </w:tcPr>
+          <w:p>
+            <w:r>
+              <w:t>News/Data</w:t>
+            </w:r>
+          </w:p>
+        </w:tc>
+        <w:tc>
+          <w:tcPr>
+            <w:tcW w:type="dxa" w:w="1242"/>
+          </w:tcPr>
+          <w:p>
+            <w:r>
+              <w:t>財經新聞/產業資料</w:t>
+            </w:r>
+          </w:p>
+        </w:tc>
+        <w:tc>
+          <w:tcPr>
+            <w:tcW w:type="dxa" w:w="1242"/>
+          </w:tcPr>
+          <w:p>
+            <w:r>
+              <w:t>Y</w:t>
+            </w:r>
+          </w:p>
+        </w:tc>
+        <w:tc>
+          <w:tcPr>
+            <w:tcW w:type="dxa" w:w="1242"/>
+          </w:tcPr>
+          <w:p>
+            <w:r>
+              <w:t>可作線索，不可替代官方財務數字</w:t>
+            </w:r>
+          </w:p>
+        </w:tc>
+        <w:tc>
+          <w:tcPr>
+            <w:tcW w:type="dxa" w:w="1242"/>
+          </w:tcPr>
+          <w:p>
+            <w:r>
+              <w:t>Y</w:t>
+            </w:r>
+          </w:p>
+        </w:tc>
+      </w:tr>
+      <w:tr>
+        <w:tc>
+          <w:tcPr>
+            <w:tcW w:type="dxa" w:w="1242"/>
+          </w:tcPr>
+          <w:p>
+            <w:r>
+              <w:t>SECONDARY_NEWS_MEDIA</w:t>
+            </w:r>
+          </w:p>
+        </w:tc>
+        <w:tc>
+          <w:tcPr>
+            <w:tcW w:type="dxa" w:w="1242"/>
+          </w:tcPr>
+          <w:p>
+            <w:r>
+              <w:t>報章雜誌媒體</w:t>
+            </w:r>
+          </w:p>
+        </w:tc>
+        <w:tc>
+          <w:tcPr>
+            <w:tcW w:type="dxa" w:w="1242"/>
+          </w:tcPr>
+          <w:p>
+            <w:r>
+              <w:t>Secondary</w:t>
+            </w:r>
+          </w:p>
+        </w:tc>
+        <w:tc>
+          <w:tcPr>
+            <w:tcW w:type="dxa" w:w="1242"/>
+          </w:tcPr>
+          <w:p>
+            <w:r>
+              <w:t>News/Data</w:t>
+            </w:r>
+          </w:p>
+        </w:tc>
+        <w:tc>
+          <w:tcPr>
+            <w:tcW w:type="dxa" w:w="1242"/>
+          </w:tcPr>
+          <w:p>
+            <w:r>
+              <w:t>財經新聞/產業資料</w:t>
+            </w:r>
+          </w:p>
+        </w:tc>
+        <w:tc>
+          <w:tcPr>
+            <w:tcW w:type="dxa" w:w="1242"/>
+          </w:tcPr>
+          <w:p>
+            <w:r>
+              <w:t>Y</w:t>
+            </w:r>
+          </w:p>
+        </w:tc>
+        <w:tc>
+          <w:tcPr>
+            <w:tcW w:type="dxa" w:w="1242"/>
+          </w:tcPr>
+          <w:p>
+            <w:r>
+              <w:t>可作線索，不可替代官方財務數字</w:t>
+            </w:r>
+          </w:p>
+        </w:tc>
+        <w:tc>
+          <w:tcPr>
+            <w:tcW w:type="dxa" w:w="1242"/>
+          </w:tcPr>
+          <w:p>
+            <w:r>
+              <w:t>Y</w:t>
+            </w:r>
+          </w:p>
+        </w:tc>
+      </w:tr>
+    </w:tbl>
+    <w:p>
+      <w:pPr>
+        <w:pStyle w:val="21"/>
+      </w:pPr>
+      <w:r>
+        <w:t>Change Log：2026-06-18｜DISCLOSURE_EVENTS_AND_NEWS_SOURCES</w:t>
+      </w:r>
+    </w:p>
+    <w:p>
+      <w:pPr>
+        <w:pStyle w:val="a0"/>
+      </w:pPr>
+      <w:r>
+        <w:t>Updated 04_disclosure_events to use event_key as the primary key.</w:t>
+      </w:r>
+    </w:p>
+    <w:p>
+      <w:pPr>
+        <w:pStyle w:val="a0"/>
+      </w:pPr>
+      <w:r>
+        <w:t>Added event_type and event_subtype hierarchy.</w:t>
+      </w:r>
+    </w:p>
+    <w:p>
+      <w:pPr>
+        <w:pStyle w:val="a0"/>
+      </w:pPr>
+      <w:r>
+        <w:t>Added major_news.* subtypes, including capital_increase, capital_reduction, share_buyback, merger, asset_disposal, new_factory, and others.</w:t>
+      </w:r>
+    </w:p>
+    <w:p>
+      <w:pPr>
+        <w:pStyle w:val="a0"/>
+      </w:pPr>
+      <w:r>
+        <w:t>Added or confirmed SECONDARY_YAHOO in 10_news_source_whitelist.</w:t>
+      </w:r>
+    </w:p>
+    <w:p>
+      <w:pPr>
+        <w:pStyle w:val="a0"/>
+      </w:pPr>
+      <w:r>
+        <w:t>Added or confirmed SECONDARY_NEWS_MEDIA in 10_news_source_whitelist.</w:t>
+      </w:r>
+    </w:p>
+    <w:p>
+      <w:pPr>
+        <w:pStyle w:val="a0"/>
+      </w:pPr>
+      <w:r>
+        <w:t>Support more precise event metadata tagging, reduce citation mismatch between earnings_call, monthly_revenue, news, and major_news, and support R4 semantic layer filtering and R6 financial QA.</w:t>
       </w:r>
     </w:p>
     <w:sectPr>

</xml_diff>

<commit_message>
docs(r6): fix event key terminology in data dictionary
</commit_message>
<xml_diff>
--- a/docs/r6/data_dictionary/Ontology_V1.2_資料字典暨協作手冊.docx
+++ b/docs/r6/data_dictionary/Ontology_V1.2_資料字典暨協作手冊.docx
@@ -16583,23 +16583,13 @@
     </w:p>
     <w:p>
       <w:r>
-        <w:t xml:space="preserve">Co-work </w:t>
-      </w:r>
-      <w:r>
-        <w:t>注意事項：必須對應</w:t>
-      </w:r>
-      <w:r>
-        <w:t xml:space="preserve"> 04_disclosure_events </w:t>
-      </w:r>
-      <w:r>
-        <w:t>的正式</w:t>
-      </w:r>
-      <w:r>
-        <w:t xml:space="preserve"> event_id</w:t>
-      </w:r>
-      <w:r>
-        <w:t>。</w:t>
-      </w:r>
+        <w:t>Co-work 注意事項：必須對應 04_disclosure_events 的正式 event_key。</w:t>
+      </w:r>
+      <w:r/>
+      <w:r/>
+      <w:r/>
+      <w:r/>
+      <w:r/>
     </w:p>
     <w:p>
       <w:r>
@@ -27531,6 +27521,38 @@
           <w:p>
             <w:r>
               <w:t>Renamed 10_news_source_whitelist.source_id to source_key for schema alignment with R4 source mapping. Added 16_quarter_table covering 2024Q1 through 2026Q4 with fiscal_period, year, quarter, yyyyqq, start_date, end_date, and month_keys mapping for quarter/month alignment.</w:t>
+            </w:r>
+          </w:p>
+        </w:tc>
+      </w:tr>
+      <w:tr>
+        <w:tc>
+          <w:tcPr>
+            <w:tcW w:type="dxa" w:w="3312"/>
+          </w:tcPr>
+          <w:p>
+            <w:r>
+              <w:t>2026-06-20</w:t>
+            </w:r>
+          </w:p>
+        </w:tc>
+        <w:tc>
+          <w:tcPr>
+            <w:tcW w:type="dxa" w:w="3312"/>
+          </w:tcPr>
+          <w:p>
+            <w:r>
+              <w:t>EVENT_KEY_TERMINOLOGY_FIX</w:t>
+            </w:r>
+          </w:p>
+        </w:tc>
+        <w:tc>
+          <w:tcPr>
+            <w:tcW w:type="dxa" w:w="3312"/>
+          </w:tcPr>
+          <w:p>
+            <w:r>
+              <w:t>修正資料字典中殘留 event_id 用語為 event_key，對齊 04_disclosure_events primary key。</w:t>
             </w:r>
           </w:p>
         </w:tc>

</xml_diff>

<commit_message>
docs(r6): update finance metric dictionary
</commit_message>
<xml_diff>
--- a/docs/r6/data_dictionary/Ontology_V1.2_資料字典暨協作手冊.docx
+++ b/docs/r6/data_dictionary/Ontology_V1.2_資料字典暨協作手冊.docx
@@ -961,10 +961,7 @@
           </w:tcPr>
           <w:p>
             <w:r>
-              <w:rPr>
-                <w:sz w:val="16"/>
-              </w:rPr>
-              <w:t>16</w:t>
+              <w:t>26</w:t>
             </w:r>
           </w:p>
         </w:tc>
@@ -8500,6 +8497,395 @@
       </w:r>
       <w:r>
         <w:t>是否會斷。</w:t>
+      </w:r>
+    </w:p>
+    <w:p>
+      <w:pPr>
+        <w:pStyle w:val="31"/>
+      </w:pPr>
+      <w:r>
+        <w:t>2026-06-23 metric_id 補充（R4）</w:t>
+      </w:r>
+    </w:p>
+    <w:tbl>
+      <w:tblPr>
+        <w:tblStyle w:val="aff2"/>
+        <w:tblW w:type="auto" w:w="0"/>
+        <w:tblLook w:firstColumn="1" w:firstRow="1" w:lastColumn="0" w:lastRow="0" w:noHBand="0" w:noVBand="1" w:val="04A0"/>
+      </w:tblPr>
+      <w:tblGrid>
+        <w:gridCol w:w="1419"/>
+        <w:gridCol w:w="1419"/>
+        <w:gridCol w:w="1419"/>
+        <w:gridCol w:w="1419"/>
+        <w:gridCol w:w="1419"/>
+        <w:gridCol w:w="1419"/>
+        <w:gridCol w:w="1419"/>
+      </w:tblGrid>
+      <w:tr>
+        <w:tc>
+          <w:tcPr>
+            <w:tcW w:type="dxa" w:w="1419"/>
+          </w:tcPr>
+          <w:p>
+            <w:r>
+              <w:t>metric_id</w:t>
+            </w:r>
+          </w:p>
+        </w:tc>
+        <w:tc>
+          <w:tcPr>
+            <w:tcW w:type="dxa" w:w="1419"/>
+          </w:tcPr>
+          <w:p>
+            <w:r>
+              <w:t>中文名稱</w:t>
+            </w:r>
+          </w:p>
+        </w:tc>
+        <w:tc>
+          <w:tcPr>
+            <w:tcW w:type="dxa" w:w="1419"/>
+          </w:tcPr>
+          <w:p>
+            <w:r>
+              <w:t>category</w:t>
+            </w:r>
+          </w:p>
+        </w:tc>
+        <w:tc>
+          <w:tcPr>
+            <w:tcW w:type="dxa" w:w="1419"/>
+          </w:tcPr>
+          <w:p>
+            <w:r>
+              <w:t>unit</w:t>
+            </w:r>
+          </w:p>
+        </w:tc>
+        <w:tc>
+          <w:tcPr>
+            <w:tcW w:type="dxa" w:w="1419"/>
+          </w:tcPr>
+          <w:p>
+            <w:r>
+              <w:t>definition</w:t>
+            </w:r>
+          </w:p>
+        </w:tc>
+        <w:tc>
+          <w:tcPr>
+            <w:tcW w:type="dxa" w:w="1419"/>
+          </w:tcPr>
+          <w:p>
+            <w:r>
+              <w:t>source_grain / frequency</w:t>
+            </w:r>
+          </w:p>
+        </w:tc>
+        <w:tc>
+          <w:tcPr>
+            <w:tcW w:type="dxa" w:w="1419"/>
+          </w:tcPr>
+          <w:p>
+            <w:r>
+              <w:t>r6_note</w:t>
+            </w:r>
+          </w:p>
+        </w:tc>
+      </w:tr>
+      <w:tr>
+        <w:tc>
+          <w:tcPr>
+            <w:tcW w:type="dxa" w:w="1419"/>
+          </w:tcPr>
+          <w:p>
+            <w:r>
+              <w:t>pretax_income</w:t>
+            </w:r>
+          </w:p>
+        </w:tc>
+        <w:tc>
+          <w:tcPr>
+            <w:tcW w:type="dxa" w:w="1419"/>
+          </w:tcPr>
+          <w:p>
+            <w:r>
+              <w:t>稅前淨利</w:t>
+            </w:r>
+          </w:p>
+        </w:tc>
+        <w:tc>
+          <w:tcPr>
+            <w:tcW w:type="dxa" w:w="1419"/>
+          </w:tcPr>
+          <w:p>
+            <w:r>
+              <w:t>獲利</w:t>
+            </w:r>
+          </w:p>
+        </w:tc>
+        <w:tc>
+          <w:tcPr>
+            <w:tcW w:type="dxa" w:w="1419"/>
+          </w:tcPr>
+          <w:p>
+            <w:r>
+              <w:t>新台幣千元</w:t>
+            </w:r>
+          </w:p>
+        </w:tc>
+        <w:tc>
+          <w:tcPr>
+            <w:tcW w:type="dxa" w:w="1419"/>
+          </w:tcPr>
+          <w:p>
+            <w:r>
+              <w:t>所得稅前損益，用於觀察公司稅前獲利能力。</w:t>
+            </w:r>
+          </w:p>
+        </w:tc>
+        <w:tc>
+          <w:tcPr>
+            <w:tcW w:type="dxa" w:w="1419"/>
+          </w:tcPr>
+          <w:p>
+            <w:r>
+              <w:t>財報/IFRS / 季/年</w:t>
+            </w:r>
+          </w:p>
+        </w:tc>
+        <w:tc>
+          <w:tcPr>
+            <w:tcW w:type="dxa" w:w="1419"/>
+          </w:tcPr>
+          <w:p>
+            <w:r>
+              <w:t>不等同於 net_income，需注意是否為稅前數。</w:t>
+            </w:r>
+          </w:p>
+        </w:tc>
+      </w:tr>
+      <w:tr>
+        <w:tc>
+          <w:tcPr>
+            <w:tcW w:type="dxa" w:w="1419"/>
+          </w:tcPr>
+          <w:p>
+            <w:r>
+              <w:t>operating_expense</w:t>
+            </w:r>
+          </w:p>
+        </w:tc>
+        <w:tc>
+          <w:tcPr>
+            <w:tcW w:type="dxa" w:w="1419"/>
+          </w:tcPr>
+          <w:p>
+            <w:r>
+              <w:t>營業費用</w:t>
+            </w:r>
+          </w:p>
+        </w:tc>
+        <w:tc>
+          <w:tcPr>
+            <w:tcW w:type="dxa" w:w="1419"/>
+          </w:tcPr>
+          <w:p>
+            <w:r>
+              <w:t>獲利</w:t>
+            </w:r>
+          </w:p>
+        </w:tc>
+        <w:tc>
+          <w:tcPr>
+            <w:tcW w:type="dxa" w:w="1419"/>
+          </w:tcPr>
+          <w:p>
+            <w:r>
+              <w:t>新台幣千元</w:t>
+            </w:r>
+          </w:p>
+        </w:tc>
+        <w:tc>
+          <w:tcPr>
+            <w:tcW w:type="dxa" w:w="1419"/>
+          </w:tcPr>
+          <w:p>
+            <w:r>
+              <w:t>營業活動相關費用，通常包含推銷費用、管理費用、研發費用等。</w:t>
+            </w:r>
+          </w:p>
+        </w:tc>
+        <w:tc>
+          <w:tcPr>
+            <w:tcW w:type="dxa" w:w="1419"/>
+          </w:tcPr>
+          <w:p>
+            <w:r>
+              <w:t>財報/IFRS / 季/年</w:t>
+            </w:r>
+          </w:p>
+        </w:tc>
+        <w:tc>
+          <w:tcPr>
+            <w:tcW w:type="dxa" w:w="1419"/>
+          </w:tcPr>
+          <w:p>
+            <w:r>
+              <w:t>若資料來源拆分 SG&amp;A / R&amp;D，需確認是否加總為營業費用。</w:t>
+            </w:r>
+          </w:p>
+        </w:tc>
+      </w:tr>
+      <w:tr>
+        <w:tc>
+          <w:tcPr>
+            <w:tcW w:type="dxa" w:w="1419"/>
+          </w:tcPr>
+          <w:p>
+            <w:r>
+              <w:t>revenue_delta</w:t>
+            </w:r>
+          </w:p>
+        </w:tc>
+        <w:tc>
+          <w:tcPr>
+            <w:tcW w:type="dxa" w:w="1419"/>
+          </w:tcPr>
+          <w:p>
+            <w:r>
+              <w:t>營收增減金額</w:t>
+            </w:r>
+          </w:p>
+        </w:tc>
+        <w:tc>
+          <w:tcPr>
+            <w:tcW w:type="dxa" w:w="1419"/>
+          </w:tcPr>
+          <w:p>
+            <w:r>
+              <w:t>成長</w:t>
+            </w:r>
+          </w:p>
+        </w:tc>
+        <w:tc>
+          <w:tcPr>
+            <w:tcW w:type="dxa" w:w="1419"/>
+          </w:tcPr>
+          <w:p>
+            <w:r>
+              <w:t>TWD_thousand</w:t>
+            </w:r>
+          </w:p>
+        </w:tc>
+        <w:tc>
+          <w:tcPr>
+            <w:tcW w:type="dxa" w:w="1419"/>
+          </w:tcPr>
+          <w:p>
+            <w:r>
+              <w:t>本期營收與比較基期營收的差額，可用於月營收、季度營收或年度營收比較。</w:t>
+            </w:r>
+          </w:p>
+        </w:tc>
+        <w:tc>
+          <w:tcPr>
+            <w:tcW w:type="dxa" w:w="1419"/>
+          </w:tcPr>
+          <w:p>
+            <w:r>
+              <w:t>計算指標 / 月/季/年</w:t>
+            </w:r>
+          </w:p>
+        </w:tc>
+        <w:tc>
+          <w:tcPr>
+            <w:tcW w:type="dxa" w:w="1419"/>
+          </w:tcPr>
+          <w:p>
+            <w:r>
+              <w:t>需搭配 comparison_base，例如 MoM、YoY、QoQ 或指定比較期間。</w:t>
+            </w:r>
+          </w:p>
+        </w:tc>
+      </w:tr>
+      <w:tr>
+        <w:tc>
+          <w:tcPr>
+            <w:tcW w:type="dxa" w:w="1419"/>
+          </w:tcPr>
+          <w:p>
+            <w:r>
+              <w:t>revenue_yoy</w:t>
+            </w:r>
+          </w:p>
+        </w:tc>
+        <w:tc>
+          <w:tcPr>
+            <w:tcW w:type="dxa" w:w="1419"/>
+          </w:tcPr>
+          <w:p>
+            <w:r>
+              <w:t>營收年增率</w:t>
+            </w:r>
+          </w:p>
+        </w:tc>
+        <w:tc>
+          <w:tcPr>
+            <w:tcW w:type="dxa" w:w="1419"/>
+          </w:tcPr>
+          <w:p>
+            <w:r>
+              <w:t>成長</w:t>
+            </w:r>
+          </w:p>
+        </w:tc>
+        <w:tc>
+          <w:tcPr>
+            <w:tcW w:type="dxa" w:w="1419"/>
+          </w:tcPr>
+          <w:p>
+            <w:r>
+              <w:t>%</w:t>
+            </w:r>
+          </w:p>
+        </w:tc>
+        <w:tc>
+          <w:tcPr>
+            <w:tcW w:type="dxa" w:w="1419"/>
+          </w:tcPr>
+          <w:p>
+            <w:r>
+              <w:t>(本期營收 - 去年同期營收) / 去年同期營收</w:t>
+            </w:r>
+          </w:p>
+        </w:tc>
+        <w:tc>
+          <w:tcPr>
+            <w:tcW w:type="dxa" w:w="1419"/>
+          </w:tcPr>
+          <w:p>
+            <w:r>
+              <w:t>計算指標 / 月/季/年</w:t>
+            </w:r>
+          </w:p>
+        </w:tc>
+        <w:tc>
+          <w:tcPr>
+            <w:tcW w:type="dxa" w:w="1419"/>
+          </w:tcPr>
+          <w:p>
+            <w:r>
+              <w:t>revenue_yoy 是單期營收年增率；不要和 ytd_yoy 混用。</w:t>
+            </w:r>
+          </w:p>
+        </w:tc>
+      </w:tr>
+    </w:tbl>
+    <w:p>
+      <w:r>
+        <w:t>R6 note：revenue_yoy 為單期營收年增率；ytd_yoy 為累計營收年增率，兩者不可混用。revenue_delta 需搭配 comparison_base 才能判斷比較基準。</w:t>
       </w:r>
     </w:p>
     <w:p>
@@ -31304,6 +31690,11 @@
       </w:pPr>
       <w:r>
         <w:t>Support more precise event metadata tagging, reduce citation mismatch between earnings_call, monthly_revenue, news, and major_news, and support R4 semantic layer filtering and R6 financial QA.</w:t>
+      </w:r>
+    </w:p>
+    <w:p>
+      <w:r>
+        <w:t>Change Log：2026-06-23｜FINANCIAL_METRIC_ENUM_UPDATE_2026-06-23｜依 R4 通知補充 03_financial_metric metric_id：pretax_income、operating_expense、revenue_delta、revenue_yoy；同步 financial_metric seed，並註明 revenue_yoy 不可與 ytd_yoy 混用。</w:t>
       </w:r>
     </w:p>
     <w:sectPr>

</xml_diff>